<commit_message>
docs: add Section 6.9 Layman and Viva breakdown of Phase P3 across all 4 leads
</commit_message>
<xml_diff>
--- a/PROJECT_KNOWLEDGE_TRANSFER_MASTER.docx
+++ b/PROJECT_KNOWLEDGE_TRANSFER_MASTER.docx
@@ -13802,6 +13802,630 @@
                 <w:sz w:val="20"/>
               </w:rPr>
               <w:t>PHASE P3 OFFICIALLY CLOSED (100% GREEN). The team is formally cleared to proceed to Phase P4 (Autonomous End-to-End Orchestration &amp; Chaos Engineering).</w:t>
+            </w:r>
+          </w:p>
+        </w:tc>
+      </w:tr>
+    </w:tbl>
+    <w:p/>
+    <w:p>
+      <w:r>
+        <w:br w:type="page"/>
+      </w:r>
+    </w:p>
+    <w:p>
+      <w:pPr>
+        <w:keepNext/>
+        <w:spacing w:before="360" w:after="120"/>
+      </w:pPr>
+      <w:r>
+        <w:rPr>
+          <w:rFonts w:ascii="Calibri" w:hAnsi="Calibri"/>
+          <w:b/>
+          <w:color w:val="0F172A"/>
+          <w:sz w:val="36"/>
+        </w:rPr>
+        <w:t>6.9 Phase P3 Complete Breakdown: What Each Person Did in Layman &amp; Easy Language</w:t>
+      </w:r>
+    </w:p>
+    <w:p>
+      <w:pPr>
+        <w:spacing w:before="40" w:after="80" w:line="276" w:lineRule="auto"/>
+      </w:pPr>
+      <w:r>
+        <w:rPr>
+          <w:rFonts w:ascii="Calibri" w:hAnsi="Calibri"/>
+          <w:color w:val="334155"/>
+          <w:sz w:val="22"/>
+        </w:rPr>
+        <w:t>Phase P3 (Component Construction) is 100% complete. This section provides an intuitive, non-jargon explanation of what each of the 4 team leads built, why they built it, how their work interconnects, and how to explain it during the project viva or evaluator review.</w:t>
+      </w:r>
+    </w:p>
+    <w:tbl>
+      <w:tblPr>
+        <w:tblW w:type="auto" w:w="0"/>
+        <w:jc w:val="center"/>
+        <w:tblLook w:firstColumn="1" w:firstRow="1" w:lastColumn="0" w:lastRow="0" w:noHBand="0" w:noVBand="1" w:val="04A0"/>
+      </w:tblPr>
+      <w:tblGrid>
+        <w:gridCol w:w="9360"/>
+      </w:tblGrid>
+      <w:tr>
+        <w:tc>
+          <w:tcPr>
+            <w:tcW w:type="dxa" w:w="9360"/>
+            <w:shd w:fill="F0F9FF"/>
+            <w:tcBorders>
+              <w:left w:val="single" w:sz="36" w:space="0" w:color="0284C7"/>
+              <w:top w:val="none"/>
+              <w:right w:val="none"/>
+              <w:bottom w:val="none"/>
+            </w:tcBorders>
+          </w:tcPr>
+          <w:p>
+            <w:pPr>
+              <w:spacing w:before="80" w:after="80"/>
+            </w:pPr>
+            <w:r>
+              <w:rPr>
+                <w:rFonts w:ascii="Calibri" w:hAnsi="Calibri"/>
+                <w:b/>
+                <w:color w:val="0284C7"/>
+                <w:sz w:val="21"/>
+              </w:rPr>
+              <w:t>[THE 4-LEAD SMART HOSPITAL ANALOGY]</w:t>
+              <w:br/>
+            </w:r>
+            <w:r>
+              <w:rPr>
+                <w:rFonts w:ascii="Calibri" w:hAnsi="Calibri"/>
+                <w:color w:val="1E293B"/>
+                <w:sz w:val="20"/>
+              </w:rPr>
+              <w:t>REAL-WORLD METAPHOR: Think of our Autonomous AIOps platform as a 'Smart Hospital for Software Services':</w:t>
+              <w:br/>
+              <w:t>1. Taranay (Backend) is the RECEPTIONIST &amp; MEDICAL RECORDS DESK: Takes in emergency calls, registers patient tickets, and saves medical records into the database.</w:t>
+              <w:br/>
+              <w:t>2. Rudra (AI/RAG) is the CHIEF MEDICAL DOCTOR (AI SRE): Reads medical textbooks (runbooks), examines lab tests (evidence/logs), and prescribes exact treatment.</w:t>
+              <w:br/>
+              <w:t>3. Vivek (Frontend) is the EMERGENCY CONTROL ROOM COCKPIT: Displays patient live status on big screens, alerts doctors, and gives the Chief Surgeon a button to approve surgery.</w:t>
+              <w:br/>
+              <w:t>4. Saurav (DevOps) is the HOSPITAL DIRECTOR &amp; DRILL SIMULATOR: Connects all phones, computers, and medical equipment, runs emergency mock drills to ensure the hospital never fails, and enforces compliance.</w:t>
+            </w:r>
+          </w:p>
+        </w:tc>
+      </w:tr>
+    </w:tbl>
+    <w:p/>
+    <w:p>
+      <w:pPr>
+        <w:keepNext/>
+        <w:spacing w:before="280" w:after="80"/>
+      </w:pPr>
+      <w:r>
+        <w:rPr>
+          <w:rFonts w:ascii="Calibri" w:hAnsi="Calibri"/>
+          <w:b/>
+          <w:color w:val="0284C7"/>
+          <w:sz w:val="28"/>
+        </w:rPr>
+        <w:t>1. Taranay (Backend Lead) — 'The Receptionist &amp; Secure Record Keeper'</w:t>
+      </w:r>
+    </w:p>
+    <w:p>
+      <w:pPr>
+        <w:spacing w:before="40" w:after="80" w:line="276" w:lineRule="auto"/>
+      </w:pPr>
+      <w:r>
+        <w:rPr>
+          <w:rFonts w:ascii="Calibri" w:hAnsi="Calibri"/>
+          <w:color w:val="334155"/>
+          <w:sz w:val="22"/>
+        </w:rPr>
+        <w:t>• What Taranay Did in P3:</w:t>
+        <w:br/>
+        <w:t>Taranay built the core FastAPI backend and database engine (apps/api).</w:t>
+        <w:br/>
+        <w:t>He set up the connection pool (max 30 connections) so the database never crashes under traffic spikes, created 4 database tables (Events, Incidents, Evidence, Diagnoses), and built the REST endpoints to receive incoming alert events.</w:t>
+        <w:br/>
+        <w:br/>
+        <w:t>• Files Worked On (11 Files):</w:t>
+        <w:br/>
+        <w:t>apps/api/src/database.py, apps/api/src/config.py, apps/api/src/main.py, apps/api/src/models/event.py, apps/api/src/models/incident.py, apps/api/src/models/evidence.py, apps/api/src/models/diagnosis.py, apps/api/src/routers/events.py, apps/api/src/routers/incidents.py, tests/test_api_events.py, docker-compose.yml.</w:t>
+        <w:br/>
+        <w:br/>
+        <w:t>• In Layman's Terms:</w:t>
+        <w:br/>
+        <w:t>Taranay built the front gate. When a server anywhere has an error, it calls Taranay's API. Taranay checks the ID card (schema validation), writes it into the official register (PostgreSQL/SQLite), and throws out any unwanted junk (blocking order_id or domain leaks).</w:t>
+        <w:br/>
+        <w:br/>
+        <w:t>• Viva Defense Answer:</w:t>
+        <w:br/>
+        <w:t>'I implemented the high-throughput ingestion gateway using SQLAlchemy 2.0 with connection pooling (pool_size=10, max_overflow=20) and enforced strict Pydantic extra="forbid" contract validation to guarantee zero domain leakage.'</w:t>
+      </w:r>
+    </w:p>
+    <w:p>
+      <w:pPr>
+        <w:keepNext/>
+        <w:spacing w:before="280" w:after="80"/>
+      </w:pPr>
+      <w:r>
+        <w:rPr>
+          <w:rFonts w:ascii="Calibri" w:hAnsi="Calibri"/>
+          <w:b/>
+          <w:color w:val="0284C7"/>
+          <w:sz w:val="28"/>
+        </w:rPr>
+        <w:t>2. Rudra (AI / RAG Lead) — 'The Expert AI Doctor &amp; Runbook Specialist'</w:t>
+      </w:r>
+    </w:p>
+    <w:p>
+      <w:pPr>
+        <w:spacing w:before="40" w:after="80" w:line="276" w:lineRule="auto"/>
+      </w:pPr>
+      <w:r>
+        <w:rPr>
+          <w:rFonts w:ascii="Calibri" w:hAnsi="Calibri"/>
+          <w:color w:val="334155"/>
+          <w:sz w:val="22"/>
+        </w:rPr>
+        <w:t>• What Rudra Did in P3:</w:t>
+        <w:br/>
+        <w:t>Rudra built the autonomous AI diagnostic brain (apps/ai-worker).</w:t>
+        <w:br/>
+        <w:t>He created a zero-cost vector search store pre-loaded with 5 engineering runbooks (solutions to database crashes, OOM memory leaks, CPU spikes, latency degradation, and auth token failures). He connected LangChain to read the error logs, match the right runbook, calculate a confidence score (0.0 to 1.0), and draft a safe remediation plan.</w:t>
+        <w:br/>
+        <w:br/>
+        <w:t>• Files Worked On (5 Files):</w:t>
+        <w:br/>
+        <w:t>apps/ai-worker/src/runbook_store.py, apps/ai-worker/src/diagnosis_service.py, apps/ai-worker/src/main.py, apps/ai-worker/src/config.py, tests/test_ai_worker.py.</w:t>
+        <w:br/>
+        <w:br/>
+        <w:t>• In Layman's Terms:</w:t>
+        <w:br/>
+        <w:t>Rudra built the AI doctor. When an error happens, the AI looks up its library of solved engineering runbooks, finds the closest match, explains why it broke, and writes a step-by-step prescription. It gives a confidence percentage and strictly requires a human to sign off before taking action.</w:t>
+        <w:br/>
+        <w:br/>
+        <w:t>• Viva Defense Answer:</w:t>
+        <w:br/>
+        <w:t>'I constructed an in-memory RAG diagnosis engine with zero cloud costs. It performs vector retrieval against verified operational runbooks, cites exact evidence IDs to prevent hallucination, and outputs P2-compliant Diagnosis and RemediationPlan contracts.'</w:t>
+      </w:r>
+    </w:p>
+    <w:p>
+      <w:pPr>
+        <w:keepNext/>
+        <w:spacing w:before="280" w:after="80"/>
+      </w:pPr>
+      <w:r>
+        <w:rPr>
+          <w:rFonts w:ascii="Calibri" w:hAnsi="Calibri"/>
+          <w:b/>
+          <w:color w:val="0284C7"/>
+          <w:sz w:val="28"/>
+        </w:rPr>
+        <w:t>3. Vivek (Frontend Lead) — 'The Emergency Control Room &amp; Cockpit Dashboard'</w:t>
+      </w:r>
+    </w:p>
+    <w:p>
+      <w:pPr>
+        <w:spacing w:before="40" w:after="80" w:line="276" w:lineRule="auto"/>
+      </w:pPr>
+      <w:r>
+        <w:rPr>
+          <w:rFonts w:ascii="Calibri" w:hAnsi="Calibri"/>
+          <w:color w:val="334155"/>
+          <w:sz w:val="22"/>
+        </w:rPr>
+        <w:t>• What Vivek Did in P3:</w:t>
+        <w:br/>
+        <w:t>Vivek built the Next.js 14 Developer Cockpit (apps/web).</w:t>
+        <w:br/>
+        <w:t>He designed a modern 3D white skeuomorphic (neumorphic) tactile interface with smooth dual drop-shadows, light/dark theme switcher, live SRE metric tiles (MTTR, Open Incidents, Healed Count, System Health), incident triage feed, telemetry evidence room, AI diagnostic inspector, and the Human-in-the-Loop 'Approve &amp; Heal' authorization button.</w:t>
+        <w:br/>
+        <w:br/>
+        <w:t>• Files Worked On (9 Files):</w:t>
+        <w:br/>
+        <w:t>apps/web/src/app/page.tsx, apps/web/src/app/layout.tsx, apps/web/src/app/globals.css, apps/web/src/components/Header.tsx, apps/web/src/components/MetricsBar.tsx, apps/web/src/components/IncidentFeed.tsx, apps/web/src/components/IncidentDetail.tsx, apps/web/src/components/TopologyView.tsx, apps/web/src/types/index.ts.</w:t>
+        <w:br/>
+        <w:br/>
+        <w:t>• In Layman's Terms:</w:t>
+        <w:br/>
+        <w:t>Vivek built the cockpit dashboard where engineers sit. Instead of reading messy command-line logs, engineers see an elegant tactile control screen showing healthy green lights, red blinking emergency alerts, what the AI recommends, and a big blue button to approve the fix.</w:t>
+        <w:br/>
+        <w:br/>
+        <w:t>• Viva Defense Answer:</w:t>
+        <w:br/>
+        <w:t>'I developed the Next.js 14 Developer Cockpit following atomic component design. It provides real-time SRE situational awareness, renders telemetry evidence rooms, and serves as the safety governance gate where human engineers review and approve AI remediation plans.'</w:t>
+      </w:r>
+    </w:p>
+    <w:p>
+      <w:pPr>
+        <w:keepNext/>
+        <w:spacing w:before="280" w:after="80"/>
+      </w:pPr>
+      <w:r>
+        <w:rPr>
+          <w:rFonts w:ascii="Calibri" w:hAnsi="Calibri"/>
+          <w:b/>
+          <w:color w:val="0284C7"/>
+          <w:sz w:val="28"/>
+        </w:rPr>
+        <w:t>4. Saurav (DevOps Lead) — 'The Master Integrator, Wire-Up Engineer &amp; Flight Simulator'</w:t>
+      </w:r>
+    </w:p>
+    <w:p>
+      <w:pPr>
+        <w:spacing w:before="40" w:after="80" w:line="276" w:lineRule="auto"/>
+      </w:pPr>
+      <w:r>
+        <w:rPr>
+          <w:rFonts w:ascii="Calibri" w:hAnsi="Calibri"/>
+          <w:color w:val="334155"/>
+          <w:sz w:val="22"/>
+        </w:rPr>
+        <w:t>• What Saurav Did in P3:</w:t>
+        <w:br/>
+        <w:t>Saurav built the multi-service test harness, resolved cross-service Python namespace collisions, constructed the interactive E2E failure simulation CLI tool, updated the incident lifecycle state machine, and authored the SaaS architecture &amp; compliance guide.</w:t>
+        <w:br/>
+        <w:t>He ensured all 31 core tests pass with 100% green status and verified zero cloud costs ($0.00).</w:t>
+        <w:br/>
+        <w:br/>
+        <w:t>• Files Worked On (7 Files):</w:t>
+        <w:br/>
+        <w:t>tests/test_e2e_pipeline.py, scripts/simulate_failure_e2e.py, apps/api/src/routers/incidents.py (PATCH status endpoint), tests/foundation/ (namespace isolation in 3 test files), docs/SAAS_ARCHITECTURE_AND_COMPLIANCE_GUIDE.md, SAAS_ARCHITECTURE_AND_COMPLIANCE_MASTER.docx, PROJECT_KNOWLEDGE_TRANSFER_MASTER.docx.</w:t>
+        <w:br/>
+        <w:br/>
+        <w:t>• In Layman's Terms:</w:t>
+        <w:br/>
+        <w:t>Saurav tied all the wires together. He made sure Taranay's backend, Rudra's AI, and Vivek's frontend communicate without errors. He built the 'Flight Simulator' script so that during presentations, anyone can press enter and watch an entire outage happen, get diagnosed by AI, get approved, and recover in 2 seconds right before the evaluator's eyes.</w:t>
+        <w:br/>
+        <w:br/>
+        <w:t>• Viva Defense Answer:</w:t>
+        <w:br/>
+        <w:t>'I designed the multi-service integration test harness and live simulation harness. I resolved Python module collision across microservice namespaces, implemented the incident lifecycle state transition endpoint, and demonstrated 100% end-to-end autonomous healing with zero domain leakage.'</w:t>
+      </w:r>
+    </w:p>
+    <w:p>
+      <w:pPr>
+        <w:keepNext/>
+        <w:spacing w:before="280" w:after="80"/>
+      </w:pPr>
+      <w:r>
+        <w:rPr>
+          <w:rFonts w:ascii="Calibri" w:hAnsi="Calibri"/>
+          <w:b/>
+          <w:color w:val="0284C7"/>
+          <w:sz w:val="28"/>
+        </w:rPr>
+        <w:t>Summary Matrix: Who Built What in Phase P3</w:t>
+      </w:r>
+    </w:p>
+    <w:tbl>
+      <w:tblPr>
+        <w:tblW w:type="auto" w:w="0"/>
+        <w:jc w:val="center"/>
+        <w:tblLook w:firstColumn="1" w:firstRow="1" w:lastColumn="0" w:lastRow="0" w:noHBand="0" w:noVBand="1" w:val="04A0"/>
+      </w:tblPr>
+      <w:tblGrid>
+        <w:gridCol w:w="2340"/>
+        <w:gridCol w:w="2340"/>
+        <w:gridCol w:w="2340"/>
+        <w:gridCol w:w="2340"/>
+      </w:tblGrid>
+      <w:tr>
+        <w:tc>
+          <w:tcPr>
+            <w:tcW w:type="dxa" w:w="2340"/>
+            <w:shd w:fill="0F172A"/>
+          </w:tcPr>
+          <w:p>
+            <w:r>
+              <w:rPr>
+                <w:rFonts w:ascii="Calibri" w:hAnsi="Calibri"/>
+                <w:b/>
+                <w:color w:val="FFFFFF"/>
+                <w:sz w:val="20"/>
+              </w:rPr>
+              <w:t>Lead &amp; Role</w:t>
+            </w:r>
+          </w:p>
+        </w:tc>
+        <w:tc>
+          <w:tcPr>
+            <w:tcW w:type="dxa" w:w="2340"/>
+            <w:shd w:fill="0F172A"/>
+          </w:tcPr>
+          <w:p>
+            <w:r>
+              <w:rPr>
+                <w:rFonts w:ascii="Calibri" w:hAnsi="Calibri"/>
+                <w:b/>
+                <w:color w:val="FFFFFF"/>
+                <w:sz w:val="20"/>
+              </w:rPr>
+              <w:t>Subsystem</w:t>
+            </w:r>
+          </w:p>
+        </w:tc>
+        <w:tc>
+          <w:tcPr>
+            <w:tcW w:type="dxa" w:w="2340"/>
+            <w:shd w:fill="0F172A"/>
+          </w:tcPr>
+          <w:p>
+            <w:r>
+              <w:rPr>
+                <w:rFonts w:ascii="Calibri" w:hAnsi="Calibri"/>
+                <w:b/>
+                <w:color w:val="FFFFFF"/>
+                <w:sz w:val="20"/>
+              </w:rPr>
+              <w:t>Key Deliverable in P3</w:t>
+            </w:r>
+          </w:p>
+        </w:tc>
+        <w:tc>
+          <w:tcPr>
+            <w:tcW w:type="dxa" w:w="2340"/>
+            <w:shd w:fill="0F172A"/>
+          </w:tcPr>
+          <w:p>
+            <w:r>
+              <w:rPr>
+                <w:rFonts w:ascii="Calibri" w:hAnsi="Calibri"/>
+                <w:b/>
+                <w:color w:val="FFFFFF"/>
+                <w:sz w:val="20"/>
+              </w:rPr>
+              <w:t>Layman Analogy</w:t>
+            </w:r>
+          </w:p>
+        </w:tc>
+      </w:tr>
+      <w:tr>
+        <w:tc>
+          <w:tcPr>
+            <w:tcW w:type="dxa" w:w="2340"/>
+          </w:tcPr>
+          <w:p>
+            <w:r>
+              <w:rPr>
+                <w:rFonts w:ascii="Calibri" w:hAnsi="Calibri"/>
+                <w:color w:val="1E293B"/>
+                <w:sz w:val="19"/>
+              </w:rPr>
+              <w:t>Taranay (Backend)</w:t>
+            </w:r>
+          </w:p>
+        </w:tc>
+        <w:tc>
+          <w:tcPr>
+            <w:tcW w:type="dxa" w:w="2340"/>
+          </w:tcPr>
+          <w:p>
+            <w:r>
+              <w:rPr>
+                <w:rFonts w:ascii="Calibri" w:hAnsi="Calibri"/>
+                <w:color w:val="1E293B"/>
+                <w:sz w:val="19"/>
+              </w:rPr>
+              <w:t>apps/api</w:t>
+            </w:r>
+          </w:p>
+        </w:tc>
+        <w:tc>
+          <w:tcPr>
+            <w:tcW w:type="dxa" w:w="2340"/>
+          </w:tcPr>
+          <w:p>
+            <w:r>
+              <w:rPr>
+                <w:rFonts w:ascii="Calibri" w:hAnsi="Calibri"/>
+                <w:color w:val="1E293B"/>
+                <w:sz w:val="19"/>
+              </w:rPr>
+              <w:t>FastAPI Ingestion + SQLite/Postgres Pool + 4 Relational Models</w:t>
+            </w:r>
+          </w:p>
+        </w:tc>
+        <w:tc>
+          <w:tcPr>
+            <w:tcW w:type="dxa" w:w="2340"/>
+          </w:tcPr>
+          <w:p>
+            <w:r>
+              <w:rPr>
+                <w:rFonts w:ascii="Calibri" w:hAnsi="Calibri"/>
+                <w:color w:val="1E293B"/>
+                <w:sz w:val="19"/>
+              </w:rPr>
+              <w:t>Receptionist: Takes emergency calls &amp; registers records</w:t>
+            </w:r>
+          </w:p>
+        </w:tc>
+      </w:tr>
+      <w:tr>
+        <w:tc>
+          <w:tcPr>
+            <w:tcW w:type="dxa" w:w="2340"/>
+          </w:tcPr>
+          <w:p>
+            <w:r>
+              <w:rPr>
+                <w:rFonts w:ascii="Calibri" w:hAnsi="Calibri"/>
+                <w:color w:val="1E293B"/>
+                <w:sz w:val="19"/>
+              </w:rPr>
+              <w:t>Rudra (AI / RAG)</w:t>
+            </w:r>
+          </w:p>
+        </w:tc>
+        <w:tc>
+          <w:tcPr>
+            <w:tcW w:type="dxa" w:w="2340"/>
+          </w:tcPr>
+          <w:p>
+            <w:r>
+              <w:rPr>
+                <w:rFonts w:ascii="Calibri" w:hAnsi="Calibri"/>
+                <w:color w:val="1E293B"/>
+                <w:sz w:val="19"/>
+              </w:rPr>
+              <w:t>apps/ai-worker</w:t>
+            </w:r>
+          </w:p>
+        </w:tc>
+        <w:tc>
+          <w:tcPr>
+            <w:tcW w:type="dxa" w:w="2340"/>
+          </w:tcPr>
+          <w:p>
+            <w:r>
+              <w:rPr>
+                <w:rFonts w:ascii="Calibri" w:hAnsi="Calibri"/>
+                <w:color w:val="1E293B"/>
+                <w:sz w:val="19"/>
+              </w:rPr>
+              <w:t>Vector Runbook Store (5 KBs) + LangChain RAG + Bounded Confidence</w:t>
+            </w:r>
+          </w:p>
+        </w:tc>
+        <w:tc>
+          <w:tcPr>
+            <w:tcW w:type="dxa" w:w="2340"/>
+          </w:tcPr>
+          <w:p>
+            <w:r>
+              <w:rPr>
+                <w:rFonts w:ascii="Calibri" w:hAnsi="Calibri"/>
+                <w:color w:val="1E293B"/>
+                <w:sz w:val="19"/>
+              </w:rPr>
+              <w:t>AI Doctor: Reads runbooks, examines logs &amp; prescribes cure</w:t>
+            </w:r>
+          </w:p>
+        </w:tc>
+      </w:tr>
+      <w:tr>
+        <w:tc>
+          <w:tcPr>
+            <w:tcW w:type="dxa" w:w="2340"/>
+          </w:tcPr>
+          <w:p>
+            <w:r>
+              <w:rPr>
+                <w:rFonts w:ascii="Calibri" w:hAnsi="Calibri"/>
+                <w:color w:val="1E293B"/>
+                <w:sz w:val="19"/>
+              </w:rPr>
+              <w:t>Vivek (Frontend)</w:t>
+            </w:r>
+          </w:p>
+        </w:tc>
+        <w:tc>
+          <w:tcPr>
+            <w:tcW w:type="dxa" w:w="2340"/>
+          </w:tcPr>
+          <w:p>
+            <w:r>
+              <w:rPr>
+                <w:rFonts w:ascii="Calibri" w:hAnsi="Calibri"/>
+                <w:color w:val="1E293B"/>
+                <w:sz w:val="19"/>
+              </w:rPr>
+              <w:t>apps/web</w:t>
+            </w:r>
+          </w:p>
+        </w:tc>
+        <w:tc>
+          <w:tcPr>
+            <w:tcW w:type="dxa" w:w="2340"/>
+          </w:tcPr>
+          <w:p>
+            <w:r>
+              <w:rPr>
+                <w:rFonts w:ascii="Calibri" w:hAnsi="Calibri"/>
+                <w:color w:val="1E293B"/>
+                <w:sz w:val="19"/>
+              </w:rPr>
+              <w:t>Next.js 14 Developer Cockpit + 3D Skeuomorphic UI + HITL Gate</w:t>
+            </w:r>
+          </w:p>
+        </w:tc>
+        <w:tc>
+          <w:tcPr>
+            <w:tcW w:type="dxa" w:w="2340"/>
+          </w:tcPr>
+          <w:p>
+            <w:r>
+              <w:rPr>
+                <w:rFonts w:ascii="Calibri" w:hAnsi="Calibri"/>
+                <w:color w:val="1E293B"/>
+                <w:sz w:val="19"/>
+              </w:rPr>
+              <w:t>Control Room: Big screen dashboard with Approve button</w:t>
+            </w:r>
+          </w:p>
+        </w:tc>
+      </w:tr>
+      <w:tr>
+        <w:tc>
+          <w:tcPr>
+            <w:tcW w:type="dxa" w:w="2340"/>
+          </w:tcPr>
+          <w:p>
+            <w:r>
+              <w:rPr>
+                <w:rFonts w:ascii="Calibri" w:hAnsi="Calibri"/>
+                <w:color w:val="1E293B"/>
+                <w:sz w:val="19"/>
+              </w:rPr>
+              <w:t>Saurav (DevOps)</w:t>
+            </w:r>
+          </w:p>
+        </w:tc>
+        <w:tc>
+          <w:tcPr>
+            <w:tcW w:type="dxa" w:w="2340"/>
+          </w:tcPr>
+          <w:p>
+            <w:r>
+              <w:rPr>
+                <w:rFonts w:ascii="Calibri" w:hAnsi="Calibri"/>
+                <w:color w:val="1E293B"/>
+                <w:sz w:val="19"/>
+              </w:rPr>
+              <w:t>infrastructure &amp; tests</w:t>
+            </w:r>
+          </w:p>
+        </w:tc>
+        <w:tc>
+          <w:tcPr>
+            <w:tcW w:type="dxa" w:w="2340"/>
+          </w:tcPr>
+          <w:p>
+            <w:r>
+              <w:rPr>
+                <w:rFonts w:ascii="Calibri" w:hAnsi="Calibri"/>
+                <w:color w:val="1E293B"/>
+                <w:sz w:val="19"/>
+              </w:rPr>
+              <w:t>E2E Integration Harness + Failure Simulator CLI + SaaS Guide</w:t>
+            </w:r>
+          </w:p>
+        </w:tc>
+        <w:tc>
+          <w:tcPr>
+            <w:tcW w:type="dxa" w:w="2340"/>
+          </w:tcPr>
+          <w:p>
+            <w:r>
+              <w:rPr>
+                <w:rFonts w:ascii="Calibri" w:hAnsi="Calibri"/>
+                <w:color w:val="1E293B"/>
+                <w:sz w:val="19"/>
+              </w:rPr>
+              <w:t>Flight Simulator: Connects all wires &amp; runs mock drills</w:t>
             </w:r>
           </w:p>
         </w:tc>

</xml_diff>